<commit_message>
Expand architecture section: check pipeline, CI/CD, layout, data format
Co-authored-by: Cursor <cursoragent@cursor.com>
</commit_message>
<xml_diff>
--- a/docs/translation-eval-harness.docx
+++ b/docs/translation-eval-harness.docx
@@ -39,6 +39,19 @@
       </w:pPr>
       <w:r>
         <w:t>2. Architecture</w:t>
+      </w:r>
+    </w:p>
+    <w:p>
+      <w:r>
+        <w:t>The project has three layers: offline data generation (phrases, glossary and simulated systems), a reference-free checking engine, and reporting (evaluation, dashboard and CI). Everything runs on the Python standard library, so it needs no API keys, databases or servers.</w:t>
+      </w:r>
+    </w:p>
+    <w:p>
+      <w:pPr>
+        <w:pStyle w:val="Heading2"/>
+      </w:pPr>
+      <w:r>
+        <w:t>2.1 System overview</w:t>
       </w:r>
     </w:p>
     <w:p>
@@ -378,6 +391,357 @@
           <w:p>
             <w:r>
               <w:t>Tests and quality gate; builds and publishes the dashboard</w:t>
+            </w:r>
+          </w:p>
+        </w:tc>
+      </w:tr>
+    </w:tbl>
+    <w:p/>
+    <w:p>
+      <w:pPr>
+        <w:pStyle w:val="Heading2"/>
+      </w:pPr>
+      <w:r>
+        <w:t>2.2 How one translation is checked</w:t>
+      </w:r>
+    </w:p>
+    <w:p>
+      <w:r>
+        <w:drawing>
+          <wp:inline xmlns:a="http://schemas.openxmlformats.org/drawingml/2006/main" xmlns:pic="http://schemas.openxmlformats.org/drawingml/2006/picture">
+            <wp:extent cx="5943600" cy="3109441"/>
+            <wp:docPr id="2" name="Picture 2"/>
+            <wp:cNvGraphicFramePr>
+              <a:graphicFrameLocks noChangeAspect="1"/>
+            </wp:cNvGraphicFramePr>
+            <a:graphic>
+              <a:graphicData uri="http://schemas.openxmlformats.org/drawingml/2006/picture">
+                <pic:pic>
+                  <pic:nvPicPr>
+                    <pic:cNvPr id="0" name="check-pipeline.png"/>
+                    <pic:cNvPicPr/>
+                  </pic:nvPicPr>
+                  <pic:blipFill>
+                    <a:blip r:embed="rId10"/>
+                    <a:stretch>
+                      <a:fillRect/>
+                    </a:stretch>
+                  </pic:blipFill>
+                  <pic:spPr>
+                    <a:xfrm>
+                      <a:off x="0" y="0"/>
+                      <a:ext cx="5943600" cy="3109441"/>
+                    </a:xfrm>
+                    <a:prstGeom prst="rect"/>
+                  </pic:spPr>
+                </pic:pic>
+              </a:graphicData>
+            </a:graphic>
+          </wp:inline>
+        </w:drawing>
+      </w:r>
+    </w:p>
+    <w:p>
+      <w:r>
+        <w:t>check(source, target, lang) splits both sentences into words and numbers, and pairs each number with the unit word after it. All six checks run independently and each returns zero or more issues with a severity and the exact words to highlight. The issues are combined into one score and a verdict. The same function is used by the CLI, the evaluation and the dashboard, so all three always agree.</w:t>
+      </w:r>
+    </w:p>
+    <w:p>
+      <w:pPr>
+        <w:pStyle w:val="Heading2"/>
+      </w:pPr>
+      <w:r>
+        <w:t>2.3 Build and deployment</w:t>
+      </w:r>
+    </w:p>
+    <w:p>
+      <w:r>
+        <w:drawing>
+          <wp:inline xmlns:a="http://schemas.openxmlformats.org/drawingml/2006/main" xmlns:pic="http://schemas.openxmlformats.org/drawingml/2006/picture">
+            <wp:extent cx="5943600" cy="2821646"/>
+            <wp:docPr id="3" name="Picture 3"/>
+            <wp:cNvGraphicFramePr>
+              <a:graphicFrameLocks noChangeAspect="1"/>
+            </wp:cNvGraphicFramePr>
+            <a:graphic>
+              <a:graphicData uri="http://schemas.openxmlformats.org/drawingml/2006/picture">
+                <pic:pic>
+                  <pic:nvPicPr>
+                    <pic:cNvPr id="0" name="ci-cd.png"/>
+                    <pic:cNvPicPr/>
+                  </pic:nvPicPr>
+                  <pic:blipFill>
+                    <a:blip r:embed="rId11"/>
+                    <a:stretch>
+                      <a:fillRect/>
+                    </a:stretch>
+                  </pic:blipFill>
+                  <pic:spPr>
+                    <a:xfrm>
+                      <a:off x="0" y="0"/>
+                      <a:ext cx="5943600" cy="2821646"/>
+                    </a:xfrm>
+                    <a:prstGeom prst="rect"/>
+                  </pic:spPr>
+                </pic:pic>
+              </a:graphicData>
+            </a:graphic>
+          </wp:inline>
+        </w:drawing>
+      </w:r>
+    </w:p>
+    <w:p>
+      <w:r>
+        <w:t>Two GitHub Actions workflows run on every push. ci.yml runs the unit tests and the quality gate, and fails the build if any critical error is missed or false alarms exceed 5%; it also runs on pull requests, so a change that weakens the checks cannot be merged unnoticed. pages.yml re-runs the evaluation, rebuilds the dashboard and publishes it to GitHub Pages, so the live page always reflects the code on main.</w:t>
+      </w:r>
+    </w:p>
+    <w:p>
+      <w:pPr>
+        <w:pStyle w:val="Heading2"/>
+      </w:pPr>
+      <w:r>
+        <w:t>2.4 Folder layout</w:t>
+      </w:r>
+    </w:p>
+    <w:p>
+      <w:pPr>
+        <w:ind w:left="360"/>
+      </w:pPr>
+      <w:r>
+        <w:rPr>
+          <w:rFonts w:ascii="Menlo" w:hAnsi="Menlo"/>
+          <w:color w:val="1F2D3D"/>
+          <w:sz w:val="17"/>
+        </w:rPr>
+        <w:t>translation-eval-harness/</w:t>
+        <w:br/>
+        <w:t>├── data/</w:t>
+        <w:br/>
+        <w:t>│   ├── phrases.json         12 English instructions + reference es / pl / pt</w:t>
+        <w:br/>
+        <w:t>│   ├── glossary.json        approved terms and false friends per language</w:t>
+        <w:br/>
+        <w:t>│   └── candidates.json      144 generated translations with the planted error</w:t>
+        <w:br/>
+        <w:t>├── tqe/</w:t>
+        <w:br/>
+        <w:t>│   ├── checks.py            the six checks, score and verdict</w:t>
+        <w:br/>
+        <w:t>│   ├── inject.py            simulated systems and error injectors</w:t>
+        <w:br/>
+        <w:t>│   ├── evaluate.py          system comparison, checker recall, CI gate</w:t>
+        <w:br/>
+        <w:t>│   ├── dashboard.py         builds site/index.html</w:t>
+        <w:br/>
+        <w:t>│   └── __main__.py          python -m tqe (check one translation)</w:t>
+        <w:br/>
+        <w:t>├── reports/results.json     every check result and all metrics</w:t>
+        <w:br/>
+        <w:t>├── site/index.html          the dashboard (one self-contained file)</w:t>
+        <w:br/>
+        <w:t>├── tests/test_checks.py     unit tests</w:t>
+        <w:br/>
+        <w:t>├── docs/                    this document, diagrams, screenshots</w:t>
+        <w:br/>
+        <w:t>└── .github/workflows/       ci.yml, pages.yml</w:t>
+      </w:r>
+    </w:p>
+    <w:p>
+      <w:pPr>
+        <w:pStyle w:val="Heading2"/>
+      </w:pPr>
+      <w:r>
+        <w:t>2.5 Data format</w:t>
+      </w:r>
+    </w:p>
+    <w:p>
+      <w:r>
+        <w:t>Each generated translation in data/candidates.json:</w:t>
+      </w:r>
+    </w:p>
+    <w:p>
+      <w:pPr>
+        <w:ind w:left="360"/>
+      </w:pPr>
+      <w:r>
+        <w:rPr>
+          <w:rFonts w:ascii="Menlo" w:hAnsi="Menlo"/>
+          <w:color w:val="1F2D3D"/>
+          <w:sz w:val="17"/>
+        </w:rPr>
+        <w:t>{</w:t>
+        <w:br/>
+        <w:t xml:space="preserve">  "id": "p01-es-b",</w:t>
+        <w:br/>
+        <w:t xml:space="preserve">  "phrase_id": "p01",</w:t>
+        <w:br/>
+        <w:t xml:space="preserve">  "lang": "es",</w:t>
+        <w:br/>
+        <w:t xml:space="preserve">  "system": "System B",</w:t>
+        <w:br/>
+        <w:t xml:space="preserve">  "source": "Take 2 tablets of 500 mg every 6 hours.",</w:t>
+        <w:br/>
+        <w:t xml:space="preserve">  "reference": "Tome 2 comprimidos de 500 mg cada 6 horas.",</w:t>
+        <w:br/>
+        <w:t xml:space="preserve">  "target": "Tome 2 comprimidos de 500 ml cada 6 horas.",</w:t>
+        <w:br/>
+        <w:t xml:space="preserve">  "planted_error": "swap_unit"</w:t>
+        <w:br/>
+        <w:t>}</w:t>
+      </w:r>
+    </w:p>
+    <w:p>
+      <w:r>
+        <w:t>planted_error is the answer key. It is null for correct translations and is never shown to the checks; only the evaluation reads it, to work out whether each mistake was caught.</w:t>
+      </w:r>
+    </w:p>
+    <w:p>
+      <w:pPr>
+        <w:pStyle w:val="Heading2"/>
+      </w:pPr>
+      <w:r>
+        <w:t>2.6 Design decisions</w:t>
+      </w:r>
+    </w:p>
+    <w:tbl>
+      <w:tblPr>
+        <w:tblStyle w:val="LightGrid-Accent1"/>
+        <w:tblW w:type="auto" w:w="0"/>
+        <w:jc w:val="center"/>
+        <w:tblLook w:firstColumn="1" w:firstRow="1" w:lastColumn="0" w:lastRow="0" w:noHBand="0" w:noVBand="1" w:val="04A0"/>
+      </w:tblPr>
+      <w:tblGrid>
+        <w:gridCol w:w="4320"/>
+        <w:gridCol w:w="4320"/>
+      </w:tblGrid>
+      <w:tr>
+        <w:tc>
+          <w:tcPr>
+            <w:tcW w:type="dxa" w:w="4320"/>
+          </w:tcPr>
+          <w:p>
+            <w:r>
+              <w:t>Decision</w:t>
+            </w:r>
+          </w:p>
+        </w:tc>
+        <w:tc>
+          <w:tcPr>
+            <w:tcW w:type="dxa" w:w="4320"/>
+          </w:tcPr>
+          <w:p>
+            <w:r>
+              <w:t>Why</w:t>
+            </w:r>
+          </w:p>
+        </w:tc>
+      </w:tr>
+      <w:tr>
+        <w:tc>
+          <w:tcPr>
+            <w:tcW w:type="dxa" w:w="4320"/>
+          </w:tcPr>
+          <w:p>
+            <w:r>
+              <w:t>Reference-free checks</w:t>
+            </w:r>
+          </w:p>
+        </w:tc>
+        <w:tc>
+          <w:tcPr>
+            <w:tcW w:type="dxa" w:w="4320"/>
+          </w:tcPr>
+          <w:p>
+            <w:r>
+              <w:t>In production there is no correct translation to compare against, so the checks use only the source, the translation and the glossary</w:t>
+            </w:r>
+          </w:p>
+        </w:tc>
+      </w:tr>
+      <w:tr>
+        <w:tc>
+          <w:tcPr>
+            <w:tcW w:type="dxa" w:w="4320"/>
+          </w:tcPr>
+          <w:p>
+            <w:r>
+              <w:t>Rules, not a model</w:t>
+            </w:r>
+          </w:p>
+        </w:tc>
+        <w:tc>
+          <w:tcPr>
+            <w:tcW w:type="dxa" w:w="4320"/>
+          </w:tcPr>
+          <w:p>
+            <w:r>
+              <w:t>Every flag is explainable and repeatable, runs offline, and costs nothing; a model-based judge can be added later for meaning-level errors</w:t>
+            </w:r>
+          </w:p>
+        </w:tc>
+      </w:tr>
+      <w:tr>
+        <w:tc>
+          <w:tcPr>
+            <w:tcW w:type="dxa" w:w="4320"/>
+          </w:tcPr>
+          <w:p>
+            <w:r>
+              <w:t>Planted errors</w:t>
+            </w:r>
+          </w:p>
+        </w:tc>
+        <w:tc>
+          <w:tcPr>
+            <w:tcW w:type="dxa" w:w="4320"/>
+          </w:tcPr>
+          <w:p>
+            <w:r>
+              <w:t>Gives a known answer for every translation, so the checker itself can be measured</w:t>
+            </w:r>
+          </w:p>
+        </w:tc>
+      </w:tr>
+      <w:tr>
+        <w:tc>
+          <w:tcPr>
+            <w:tcW w:type="dxa" w:w="4320"/>
+          </w:tcPr>
+          <w:p>
+            <w:r>
+              <w:t>Severity levels</w:t>
+            </w:r>
+          </w:p>
+        </w:tc>
+        <w:tc>
+          <w:tcPr>
+            <w:tcW w:type="dxa" w:w="4320"/>
+          </w:tcPr>
+          <w:p>
+            <w:r>
+              <w:t>Critical issues block the translation; minor ones only ask for a human look, which keeps reviewers focused on what matters</w:t>
+            </w:r>
+          </w:p>
+        </w:tc>
+      </w:tr>
+      <w:tr>
+        <w:tc>
+          <w:tcPr>
+            <w:tcW w:type="dxa" w:w="4320"/>
+          </w:tcPr>
+          <w:p>
+            <w:r>
+              <w:t>Single-file dashboard</w:t>
+            </w:r>
+          </w:p>
+        </w:tc>
+        <w:tc>
+          <w:tcPr>
+            <w:tcW w:type="dxa" w:w="4320"/>
+          </w:tcPr>
+          <w:p>
+            <w:r>
+              <w:t>No server or JavaScript libraries; it opens offline and hosts free on GitHub Pages</w:t>
             </w:r>
           </w:p>
         </w:tc>
@@ -1008,7 +1372,7 @@
         <w:drawing>
           <wp:inline xmlns:a="http://schemas.openxmlformats.org/drawingml/2006/main" xmlns:pic="http://schemas.openxmlformats.org/drawingml/2006/picture">
             <wp:extent cx="5943600" cy="9339943"/>
-            <wp:docPr id="2" name="Picture 2"/>
+            <wp:docPr id="4" name="Picture 4"/>
             <wp:cNvGraphicFramePr>
               <a:graphicFrameLocks noChangeAspect="1"/>
             </wp:cNvGraphicFramePr>
@@ -1020,7 +1384,7 @@
                     <pic:cNvPicPr/>
                   </pic:nvPicPr>
                   <pic:blipFill>
-                    <a:blip r:embed="rId10"/>
+                    <a:blip r:embed="rId12"/>
                     <a:stretch>
                       <a:fillRect/>
                     </a:stretch>
@@ -1049,7 +1413,7 @@
         <w:drawing>
           <wp:inline xmlns:a="http://schemas.openxmlformats.org/drawingml/2006/main" xmlns:pic="http://schemas.openxmlformats.org/drawingml/2006/picture">
             <wp:extent cx="5943600" cy="6368143"/>
-            <wp:docPr id="3" name="Picture 3"/>
+            <wp:docPr id="5" name="Picture 5"/>
             <wp:cNvGraphicFramePr>
               <a:graphicFrameLocks noChangeAspect="1"/>
             </wp:cNvGraphicFramePr>
@@ -1061,7 +1425,7 @@
                     <pic:cNvPicPr/>
                   </pic:nvPicPr>
                   <pic:blipFill>
-                    <a:blip r:embed="rId11"/>
+                    <a:blip r:embed="rId13"/>
                     <a:stretch>
                       <a:fillRect/>
                     </a:stretch>

</xml_diff>